<commit_message>
Reescribir analisis de opciones en lenguaje accesible con glosario
Co-Authored-By: Claude Opus 4.8 <noreply@anthropic.com>
Claude-Session: https://claude.ai/code/session_01BZbwFUrzke1VS1eyff3BJB
</commit_message>
<xml_diff>
--- a/opciones-semanales/estrategia-semana-2026-07-06.docx
+++ b/opciones-semanales/estrategia-semana-2026-07-06.docx
@@ -12,7 +12,7 @@
           <w:color w:val="1F3A5F"/>
           <w:sz w:val="44"/>
         </w:rPr>
-        <w:t>Estrategia semanal de opciones</w:t>
+        <w:t>Qué opciones operar esta semana</w:t>
       </w:r>
     </w:p>
     <w:p>
@@ -24,7 +24,7 @@
           <w:color w:val="2E74B5"/>
           <w:sz w:val="26"/>
         </w:rPr>
-        <w:t>Semana del 6 al 10 de julio de 2026</w:t>
+        <w:t>Guía explicada paso a paso — Semana del 6 al 10 de julio de 2026</w:t>
       </w:r>
     </w:p>
     <w:p>
@@ -37,13 +37,12 @@
           <w:color w:val="555555"/>
           <w:sz w:val="18"/>
         </w:rPr>
-        <w:t>Análisis educativo — no constituye asesoría financiera personalizada. Strikes y primas aproximados: verificar la cadena de opciones en tiempo real antes de operar.</w:t>
+        <w:t>Documento educativo. No es asesoría financiera personalizada. Los precios (strikes) y primas son aproximados: verifica la cadena de opciones real de tu bróker antes de operar.</w:t>
       </w:r>
     </w:p>
-    <w:p/>
     <w:p>
       <w:pPr>
-        <w:spacing w:before="240" w:after="120"/>
+        <w:spacing w:before="280" w:after="120"/>
       </w:pPr>
       <w:r>
         <w:rPr>
@@ -51,7 +50,294 @@
           <w:color w:val="1F3A5F"/>
           <w:sz w:val="30"/>
         </w:rPr>
-        <w:t>1. Contexto de mercado</w:t>
+        <w:t>Antes de empezar: diccionario rápido</w:t>
+      </w:r>
+    </w:p>
+    <w:p>
+      <w:pPr>
+        <w:spacing w:after="120"/>
+      </w:pPr>
+      <w:r>
+        <w:rPr>
+          <w:b w:val="0"/>
+          <w:i/>
+          <w:color w:val="555555"/>
+          <w:sz w:val="20"/>
+        </w:rPr>
+        <w:t>Si es la primera vez que ves estos términos, lee esto primero. Todo lo demás se apoya en estas 12 palabras.</w:t>
+      </w:r>
+    </w:p>
+    <w:p>
+      <w:pPr>
+        <w:pStyle w:val="ListBullet"/>
+        <w:spacing w:after="100"/>
+      </w:pPr>
+      <w:r>
+        <w:rPr>
+          <w:b/>
+          <w:color w:val="2E74B5"/>
+        </w:rPr>
+        <w:t xml:space="preserve">Opción: </w:t>
+      </w:r>
+      <w:r>
+        <w:t>un contrato que te da el DERECHO (no la obligación) de comprar o vender una acción a un precio fijo antes de una fecha. Pagas o cobras una "prima" por ese derecho.</w:t>
+      </w:r>
+    </w:p>
+    <w:p>
+      <w:pPr>
+        <w:pStyle w:val="ListBullet"/>
+        <w:spacing w:after="100"/>
+      </w:pPr>
+      <w:r>
+        <w:rPr>
+          <w:b/>
+          <w:color w:val="2E74B5"/>
+        </w:rPr>
+        <w:t xml:space="preserve">Call (opción de compra): </w:t>
+      </w:r>
+      <w:r>
+        <w:t>te da derecho a COMPRAR la acción a un precio fijo. Ganas valor si la acción SUBE.</w:t>
+      </w:r>
+    </w:p>
+    <w:p>
+      <w:pPr>
+        <w:pStyle w:val="ListBullet"/>
+        <w:spacing w:after="100"/>
+      </w:pPr>
+      <w:r>
+        <w:rPr>
+          <w:b/>
+          <w:color w:val="2E74B5"/>
+        </w:rPr>
+        <w:t xml:space="preserve">Put (opción de venta): </w:t>
+      </w:r>
+      <w:r>
+        <w:t>te da derecho a VENDER la acción a un precio fijo. Ganas valor si la acción BAJA.</w:t>
+      </w:r>
+    </w:p>
+    <w:p>
+      <w:pPr>
+        <w:pStyle w:val="ListBullet"/>
+        <w:spacing w:after="100"/>
+      </w:pPr>
+      <w:r>
+        <w:rPr>
+          <w:b/>
+          <w:color w:val="2E74B5"/>
+        </w:rPr>
+        <w:t xml:space="preserve">Strike (precio de ejercicio): </w:t>
+      </w:r>
+      <w:r>
+        <w:t>el precio fijo pactado en el contrato. Por ejemplo, "put 90" = derecho a vender a $90.</w:t>
+      </w:r>
+    </w:p>
+    <w:p>
+      <w:pPr>
+        <w:pStyle w:val="ListBullet"/>
+        <w:spacing w:after="100"/>
+      </w:pPr>
+      <w:r>
+        <w:rPr>
+          <w:b/>
+          <w:color w:val="2E74B5"/>
+        </w:rPr>
+        <w:t xml:space="preserve">Prima: </w:t>
+      </w:r>
+      <w:r>
+        <w:t>el precio de la opción. El COMPRADOR la paga; el VENDEDOR la cobra y se la queda si la opción expira sin valor.</w:t>
+      </w:r>
+    </w:p>
+    <w:p>
+      <w:pPr>
+        <w:pStyle w:val="ListBullet"/>
+        <w:spacing w:after="100"/>
+      </w:pPr>
+      <w:r>
+        <w:rPr>
+          <w:b/>
+          <w:color w:val="2E74B5"/>
+        </w:rPr>
+        <w:t xml:space="preserve">Comprar vs. Vender una opción: </w:t>
+      </w:r>
+      <w:r>
+        <w:t>comprar = pagas prima y apuestas a un movimiento (pérdida limitada a lo que pagaste). Vender = cobras prima por adelantado y apuestas a que NO ocurra el movimiento (ganancia limitada a la prima, pero riesgo mayor).</w:t>
+      </w:r>
+    </w:p>
+    <w:p>
+      <w:pPr>
+        <w:pStyle w:val="ListBullet"/>
+        <w:spacing w:after="100"/>
+      </w:pPr>
+      <w:r>
+        <w:rPr>
+          <w:b/>
+          <w:color w:val="2E74B5"/>
+        </w:rPr>
+        <w:t xml:space="preserve">Spread (diferencial): </w:t>
+      </w:r>
+      <w:r>
+        <w:t>combinar dos opciones a la vez (una comprada y una vendida). Sirve para ABARATAR la operación y, sobre todo, para PONER UN TOPE a la pérdida máxima. Es la forma "con red de seguridad".</w:t>
+      </w:r>
+    </w:p>
+    <w:p>
+      <w:pPr>
+        <w:pStyle w:val="ListBullet"/>
+        <w:spacing w:after="100"/>
+      </w:pPr>
+      <w:r>
+        <w:rPr>
+          <w:b/>
+          <w:color w:val="2E74B5"/>
+        </w:rPr>
+        <w:t xml:space="preserve">Vencimiento (expiración): </w:t>
+      </w:r>
+      <w:r>
+        <w:t>la fecha en que la opción muere. Si para entonces no sirve, vale cero.</w:t>
+      </w:r>
+    </w:p>
+    <w:p>
+      <w:pPr>
+        <w:pStyle w:val="ListBullet"/>
+        <w:spacing w:after="100"/>
+      </w:pPr>
+      <w:r>
+        <w:rPr>
+          <w:b/>
+          <w:color w:val="2E74B5"/>
+        </w:rPr>
+        <w:t xml:space="preserve">Volatilidad implícita (IV): </w:t>
+      </w:r>
+      <w:r>
+        <w:t>el "nerviosismo" que el mercado espera. IV alta = opciones CARAS (bueno para el que vende prima). IV baja = opciones BARATAS (bueno para el que compra).</w:t>
+      </w:r>
+    </w:p>
+    <w:p>
+      <w:pPr>
+        <w:pStyle w:val="ListBullet"/>
+        <w:spacing w:after="100"/>
+      </w:pPr>
+      <w:r>
+        <w:rPr>
+          <w:b/>
+          <w:color w:val="2E74B5"/>
+        </w:rPr>
+        <w:t xml:space="preserve">VIX: </w:t>
+      </w:r>
+      <w:r>
+        <w:t>el "termómetro del miedo" del mercado en general. Bajo (~16 hoy) = mercado tranquilo y opciones baratas.</w:t>
+      </w:r>
+    </w:p>
+    <w:p>
+      <w:pPr>
+        <w:pStyle w:val="ListBullet"/>
+        <w:spacing w:after="100"/>
+      </w:pPr>
+      <w:r>
+        <w:rPr>
+          <w:b/>
+          <w:color w:val="2E74B5"/>
+        </w:rPr>
+        <w:t xml:space="preserve">Earnings (resultados trimestrales): </w:t>
+      </w:r>
+      <w:r>
+        <w:t>el día en que una empresa publica sus cuentas. Antes del reporte la IV sube (nervios); justo después se desploma. Ese desplome se llama IV crush.</w:t>
+      </w:r>
+    </w:p>
+    <w:p>
+      <w:pPr>
+        <w:pStyle w:val="ListBullet"/>
+        <w:spacing w:after="100"/>
+      </w:pPr>
+      <w:r>
+        <w:rPr>
+          <w:b/>
+          <w:color w:val="2E74B5"/>
+        </w:rPr>
+        <w:t xml:space="preserve">IV crush: </w:t>
+      </w:r>
+      <w:r>
+        <w:t>la caída brusca de la volatilidad (y por tanto del precio de las opciones) justo DESPUÉS de un earnings. Perjudica al que compró opciones y beneficia al que las vendió.</w:t>
+      </w:r>
+    </w:p>
+    <w:p>
+      <w:pPr>
+        <w:pStyle w:val="ListBullet"/>
+        <w:spacing w:after="100"/>
+      </w:pPr>
+      <w:r>
+        <w:rPr>
+          <w:b/>
+          <w:color w:val="2E74B5"/>
+        </w:rPr>
+        <w:t xml:space="preserve">Theta (desgaste por tiempo): </w:t>
+      </w:r>
+      <w:r>
+        <w:t>las opciones pierden un poquito de valor cada día que pasa, como un cubo de hielo derritiéndose. Perjudica al comprador y beneficia al vendedor.</w:t>
+      </w:r>
+    </w:p>
+    <w:p>
+      <w:r>
+        <w:br w:type="page"/>
+      </w:r>
+    </w:p>
+    <w:p>
+      <w:pPr>
+        <w:spacing w:before="280" w:after="120"/>
+      </w:pPr>
+      <w:r>
+        <w:rPr>
+          <w:b/>
+          <w:color w:val="1F3A5F"/>
+          <w:sz w:val="30"/>
+        </w:rPr>
+        <w:t>1. Cómo está el mercado esta semana</w:t>
+      </w:r>
+    </w:p>
+    <w:p>
+      <w:pPr>
+        <w:spacing w:after="80"/>
+      </w:pPr>
+      <w:r>
+        <w:rPr>
+          <w:b w:val="0"/>
+          <w:i w:val="0"/>
+          <w:sz w:val="22"/>
+        </w:rPr>
+        <w:t>En pocas palabras: el mercado está en máximos y tranquilo (poco miedo). Eso tiene dos consecuencias prácticas:</w:t>
+      </w:r>
+    </w:p>
+    <w:p>
+      <w:pPr>
+        <w:spacing w:after="60"/>
+      </w:pPr>
+      <w:r>
+        <w:rPr>
+          <w:b/>
+        </w:rPr>
+        <w:t>1) Las opciones están baratas en general</w:t>
+      </w:r>
+      <w:r>
+        <w:rPr>
+          <w:b w:val="0"/>
+        </w:rPr>
+        <w:t>, así que cuando queramos apostar a una dirección, conviene COMPRAR (pagar prima barata) en lugar de vender.</w:t>
+      </w:r>
+    </w:p>
+    <w:p>
+      <w:pPr>
+        <w:spacing w:after="160"/>
+      </w:pPr>
+      <w:r>
+        <w:rPr>
+          <w:b/>
+        </w:rPr>
+        <w:t>2) La única excepción son las empresas que reportan resultados esta semana</w:t>
+      </w:r>
+      <w:r>
+        <w:rPr>
+          <w:b w:val="0"/>
+        </w:rPr>
+        <w:t xml:space="preserve"> (Delta y PepsiCo): en ellas la volatilidad está inflada y ahí sí conviene VENDER prima cara.</w:t>
       </w:r>
     </w:p>
     <w:tbl>
@@ -78,7 +364,7 @@
                 <w:b/>
                 <w:sz w:val="20"/>
               </w:rPr>
-              <w:t>Indicador</w:t>
+              <w:t>Dato</w:t>
             </w:r>
           </w:p>
         </w:tc>
@@ -93,7 +379,7 @@
                 <w:b/>
                 <w:sz w:val="20"/>
               </w:rPr>
-              <w:t>Lectura</w:t>
+              <w:t>Cómo está</w:t>
             </w:r>
           </w:p>
         </w:tc>
@@ -108,7 +394,7 @@
                 <w:b/>
                 <w:sz w:val="20"/>
               </w:rPr>
-              <w:t>Implicancia</w:t>
+              <w:t>Qué significa para nosotros</w:t>
             </w:r>
           </w:p>
         </w:tc>
@@ -124,7 +410,7 @@
               <w:rPr>
                 <w:sz w:val="19"/>
               </w:rPr>
-              <w:t>S&amp;P 500</w:t>
+              <w:t>S&amp;P 500 (el índice general de EE.UU.)</w:t>
             </w:r>
           </w:p>
         </w:tc>
@@ -138,7 +424,7 @@
               <w:rPr>
                 <w:sz w:val="19"/>
               </w:rPr>
-              <w:t>7,483 (+1.8% la semana pasada, máximos)</w:t>
+              <w:t>7,483, en máximos (+1.8% la semana pasada)</w:t>
             </w:r>
           </w:p>
         </w:tc>
@@ -152,7 +438,7 @@
               <w:rPr>
                 <w:sz w:val="19"/>
               </w:rPr>
-              <w:t>Sesgo alcista, pero poco margen de error</w:t>
+              <w:t>Tendencia hacia arriba, pero cara: poco margen para errores</w:t>
             </w:r>
           </w:p>
         </w:tc>
@@ -168,7 +454,7 @@
               <w:rPr>
                 <w:sz w:val="19"/>
               </w:rPr>
-              <w:t>VIX</w:t>
+              <w:t>VIX (termómetro del miedo)</w:t>
             </w:r>
           </w:p>
         </w:tc>
@@ -182,7 +468,7 @@
               <w:rPr>
                 <w:sz w:val="19"/>
               </w:rPr>
-              <w:t>~15.8 (banda media-baja 12–20)</w:t>
+              <w:t>~15.8, nivel bajo-normal</w:t>
             </w:r>
           </w:p>
         </w:tc>
@@ -196,7 +482,7 @@
               <w:rPr>
                 <w:sz w:val="19"/>
               </w:rPr>
-              <w:t>Prima barata: favorece comprar direccional con riesgo definido; vender prima desnuda paga poco en índices</w:t>
+              <w:t>Opciones baratas: mejor comprar apuestas direccionales que venderlas</w:t>
             </w:r>
           </w:p>
         </w:tc>
@@ -212,7 +498,7 @@
               <w:rPr>
                 <w:sz w:val="19"/>
               </w:rPr>
-              <w:t>Fed</w:t>
+              <w:t>La Reserva Federal (banco central)</w:t>
             </w:r>
           </w:p>
         </w:tc>
@@ -226,7 +512,7 @@
               <w:rPr>
                 <w:sz w:val="19"/>
               </w:rPr>
-              <w:t>Kevin Warsh (nuevo presidente), tono hawkish. Minutas FOMC el miércoles 8</w:t>
+              <w:t>Publica sus "minutas" el miércoles 8</w:t>
             </w:r>
           </w:p>
         </w:tc>
@@ -240,7 +526,7 @@
               <w:rPr>
                 <w:sz w:val="19"/>
               </w:rPr>
-              <w:t>Único evento macro capaz de mover el mercado esta semana</w:t>
+              <w:t>Único evento capaz de sacudir el mercado esta semana</w:t>
             </w:r>
           </w:p>
         </w:tc>
@@ -256,7 +542,7 @@
               <w:rPr>
                 <w:sz w:val="19"/>
               </w:rPr>
-              <w:t>Recorte en septiembre</w:t>
+              <w:t>Resultados trimestrales</w:t>
             </w:r>
           </w:p>
         </w:tc>
@@ -270,7 +556,7 @@
               <w:rPr>
                 <w:sz w:val="19"/>
               </w:rPr>
-              <w:t>Probabilidad ~60–65%</w:t>
+              <w:t>PepsiCo (jueves 9), Delta (viernes 10)</w:t>
             </w:r>
           </w:p>
         </w:tc>
@@ -284,51 +570,7 @@
               <w:rPr>
                 <w:sz w:val="19"/>
               </w:rPr>
-              <w:t>Fondo de liquidez aún favorable a la renta variable</w:t>
-            </w:r>
-          </w:p>
-        </w:tc>
-      </w:tr>
-      <w:tr>
-        <w:tc>
-          <w:tcPr>
-            <w:tcW w:type="dxa" w:w="2880"/>
-          </w:tcPr>
-          <w:p>
-            <w:r/>
-            <w:r>
-              <w:rPr>
-                <w:sz w:val="19"/>
-              </w:rPr>
-              <w:t>Resultados Q2</w:t>
-            </w:r>
-          </w:p>
-        </w:tc>
-        <w:tc>
-          <w:tcPr>
-            <w:tcW w:type="dxa" w:w="2880"/>
-          </w:tcPr>
-          <w:p>
-            <w:r/>
-            <w:r>
-              <w:rPr>
-                <w:sz w:val="19"/>
-              </w:rPr>
-              <w:t>PepsiCo (jue 9), Delta (vie 10), Levi's</w:t>
-            </w:r>
-          </w:p>
-        </w:tc>
-        <w:tc>
-          <w:tcPr>
-            <w:tcW w:type="dxa" w:w="2880"/>
-          </w:tcPr>
-          <w:p>
-            <w:r/>
-            <w:r>
-              <w:rPr>
-                <w:sz w:val="19"/>
-              </w:rPr>
-              <w:t>IV inflada solo en nombres puntuales: ahí sí conviene vender prima</w:t>
+              <w:t>Volatilidad inflada solo en estas: ahí conviene vender prima</w:t>
             </w:r>
           </w:p>
         </w:tc>
@@ -358,7 +600,7 @@
               <w:rPr>
                 <w:sz w:val="19"/>
               </w:rPr>
-              <w:t>A la baja tras el tratado interino EEUU–Irán</w:t>
+              <w:t>Cayendo (paz interina EE.UU.–Irán)</w:t>
             </w:r>
           </w:p>
         </w:tc>
@@ -372,24 +614,54 @@
               <w:rPr>
                 <w:sz w:val="19"/>
               </w:rPr>
-              <w:t>Beneficia a aerolíneas (Delta: ~$300M extra en refinería)</w:t>
+              <w:t>Muy bueno para aerolíneas como Delta (menos costo de combustible)</w:t>
             </w:r>
           </w:p>
         </w:tc>
       </w:tr>
     </w:tbl>
-    <w:p/>
+    <w:p>
+      <w:r>
+        <w:br w:type="page"/>
+      </w:r>
+    </w:p>
     <w:p>
       <w:pPr>
-        <w:spacing w:before="120" w:after="120"/>
+        <w:spacing w:before="280" w:after="120"/>
+      </w:pPr>
+      <w:r>
+        <w:rPr>
+          <w:b/>
+          <w:color w:val="1F3A5F"/>
+          <w:sz w:val="30"/>
+        </w:rPr>
+        <w:t>2. Las 4 operaciones recomendadas (de mayor a menor confianza)</w:t>
+      </w:r>
+    </w:p>
+    <w:p>
+      <w:pPr>
+        <w:spacing w:before="280" w:after="120"/>
       </w:pPr>
       <w:r>
         <w:rPr>
           <w:b/>
           <w:color w:val="2E74B5"/>
-          <w:sz w:val="24"/>
+          <w:sz w:val="26"/>
         </w:rPr>
-        <w:t>Situación de los subyacentes candidatos</w:t>
+        <w:t>Idea 1 — Delta (DAL): apostar a que NO caerá mucho antes de sus resultados</w:t>
+      </w:r>
+    </w:p>
+    <w:p>
+      <w:pPr>
+        <w:spacing w:after="80"/>
+      </w:pPr>
+      <w:r>
+        <w:rPr>
+          <w:b w:val="0"/>
+          <w:i w:val="0"/>
+          <w:sz w:val="22"/>
+        </w:rPr>
+        <w:t>Estrategia: Bull Put Spread ("diferencial alcista con puts"). En simple: cobras dinero hoy a cambio de apostar a que la acción se mantiene por encima de cierto nivel, y compras una segunda opción como red de seguridad para que tu pérdida nunca sea ilimitada.</w:t>
       </w:r>
     </w:p>
     <w:p>
@@ -401,13 +673,77 @@
         <w:rPr>
           <w:b/>
         </w:rPr>
-        <w:t xml:space="preserve">AAPL ($308.6): </w:t>
+        <w:t xml:space="preserve">Cómo se arma: </w:t>
       </w:r>
       <w:r>
         <w:rPr>
           <w:b w:val="0"/>
         </w:rPr>
-        <w:t>fuerte momentum, a ~4% de superar a Nvidia como la empresa más valiosa del mundo. Earnings a fin de mes (fuera de esta ventana).</w:t>
+        <w:t>vendes una put con strike 90 (cobras prima) y compras una put con strike 85 (pagas menos prima). Vencimiento 10 o 17 de julio. Te quedas con la diferencia como ganancia si Delta cierra por encima de $90.</w:t>
+      </w:r>
+    </w:p>
+    <w:p>
+      <w:pPr>
+        <w:pStyle w:val="ListBullet"/>
+        <w:spacing w:after="120"/>
+      </w:pPr>
+      <w:r>
+        <w:rPr>
+          <w:b/>
+          <w:color w:val="2E7D32"/>
+        </w:rPr>
+        <w:t xml:space="preserve">Por qué tiene sentido (la justificación): </w:t>
+      </w:r>
+      <w:r>
+        <w:rPr>
+          <w:b w:val="0"/>
+        </w:rPr>
+        <w:t>cuatro razones apuntan a lo mismo. (a) Delta reporta el viernes con la volatilidad inflada, y justo después esa volatilidad se desploma (IV crush), lo que abarata las opciones que vendimos y nos da ganancia. (b) El petróleo bajó por la paz EE.UU.–Irán, y eso le ahorra a Delta unos $300 millones. (c) 22 de 24 analistas la califican "compra fuerte" y ha superado sus previsiones 4 trimestres seguidos. (d) Tiene un soporte técnico en $92.7, es decir, un nivel donde históricamente los compradores frenan las caídas. Todo empuja a que se mantenga arriba.</w:t>
+      </w:r>
+    </w:p>
+    <w:p>
+      <w:pPr>
+        <w:pStyle w:val="ListBullet"/>
+        <w:spacing w:after="120"/>
+      </w:pPr>
+      <w:r>
+        <w:rPr>
+          <w:b/>
+          <w:color w:val="B72828"/>
+        </w:rPr>
+        <w:t xml:space="preserve">El riesgo (dicho con claridad): </w:t>
+      </w:r>
+      <w:r>
+        <w:rPr>
+          <w:b w:val="0"/>
+        </w:rPr>
+        <w:t>se espera que su ganancia por acción caiga ~32% frente al año pasado. Si además da malas previsiones y rompe el soporte, perderías — pero la pérdida está TOPADA (el spread la limita). Regla: cerrar cuando lleves ganado el 50–60% del máximo.</w:t>
+      </w:r>
+    </w:p>
+    <w:p>
+      <w:pPr>
+        <w:spacing w:before="280" w:after="120"/>
+      </w:pPr>
+      <w:r>
+        <w:rPr>
+          <w:b/>
+          <w:color w:val="2E74B5"/>
+          <w:sz w:val="26"/>
+        </w:rPr>
+        <w:t>Idea 2 — Microsoft (MSFT): cobrar por comprometerte a comprarla más barata</w:t>
+      </w:r>
+    </w:p>
+    <w:p>
+      <w:pPr>
+        <w:spacing w:after="80"/>
+      </w:pPr>
+      <w:r>
+        <w:rPr>
+          <w:b w:val="0"/>
+          <w:i w:val="0"/>
+          <w:sz w:val="22"/>
+        </w:rPr>
+        <w:t>Estrategia: Venta de Put ("cash-secured", es decir, con el dinero reservado para comprar si te toca). En simple: te pagan hoy por prometer que comprarías Microsoft un poco más abajo del precio actual.</w:t>
       </w:r>
     </w:p>
     <w:p>
@@ -419,13 +755,77 @@
         <w:rPr>
           <w:b/>
         </w:rPr>
-        <w:t xml:space="preserve">MSFT ($384): </w:t>
+        <w:t xml:space="preserve">Cómo se arma: </w:t>
       </w:r>
       <w:r>
         <w:rPr>
           <w:b w:val="0"/>
         </w:rPr>
-        <w:t>la peor del Magnificent 7, −24% en el año, mínimos desde 2023 por dudas sobre el capex en IA. Michael Burry compró calls apostando a $700–750 en 2028. Pesimismo extremo ya en precio.</w:t>
+        <w:t>vendes una put con strike 370 y reservas el efectivo por si te asignan las acciones. Alternativa con red de seguridad: spread 370/360. Vencimiento 17 de julio, ANTES de sus resultados de fin de mes (para no exponerte a la sorpresa del reporte).</w:t>
+      </w:r>
+    </w:p>
+    <w:p>
+      <w:pPr>
+        <w:pStyle w:val="ListBullet"/>
+        <w:spacing w:after="120"/>
+      </w:pPr>
+      <w:r>
+        <w:rPr>
+          <w:b/>
+          <w:color w:val="2E7D32"/>
+        </w:rPr>
+        <w:t xml:space="preserve">Por qué tiene sentido (la justificación): </w:t>
+      </w:r>
+      <w:r>
+        <w:rPr>
+          <w:b w:val="0"/>
+        </w:rPr>
+        <w:t>Microsoft es la peor del grupo de las grandes tecnológicas: ha caído 24% y está en mínimos desde 2023 por miedo a que gaste demasiado en centros de datos para IA. Cuando TODOS ya están pesimistas, el precio suele estar cerca de un suelo (a esto se le llama "capitulación"). Señal reveladora: el famoso inversor Michael Burry compró calls apostando a que subirá a $700+. Al vender la put, si la acción NO baja te quedas la prima; y si baja, terminas comprando una empresa sólida con doble descuento. Ganas en los dos escenarios razonables.</w:t>
+      </w:r>
+    </w:p>
+    <w:p>
+      <w:pPr>
+        <w:pStyle w:val="ListBullet"/>
+        <w:spacing w:after="120"/>
+      </w:pPr>
+      <w:r>
+        <w:rPr>
+          <w:b/>
+          <w:color w:val="B72828"/>
+        </w:rPr>
+        <w:t xml:space="preserve">El riesgo (dicho con claridad): </w:t>
+      </w:r>
+      <w:r>
+        <w:rPr>
+          <w:b w:val="0"/>
+        </w:rPr>
+        <w:t>si el mercado sigue castigando el gasto en IA, podría seguir cayendo ("agarrar un cuchillo que cae"). Por eso: hazlo solo con dinero que estés dispuesto a usar para comprar la acción, o usa el spread para limitar la pérdida.</w:t>
+      </w:r>
+    </w:p>
+    <w:p>
+      <w:pPr>
+        <w:spacing w:before="280" w:after="120"/>
+      </w:pPr>
+      <w:r>
+        <w:rPr>
+          <w:b/>
+          <w:color w:val="2E74B5"/>
+          <w:sz w:val="26"/>
+        </w:rPr>
+        <w:t>Idea 3 — Apple (AAPL): apostar a una subida moderada, barato</w:t>
+      </w:r>
+    </w:p>
+    <w:p>
+      <w:pPr>
+        <w:spacing w:after="80"/>
+      </w:pPr>
+      <w:r>
+        <w:rPr>
+          <w:b w:val="0"/>
+          <w:i w:val="0"/>
+          <w:sz w:val="22"/>
+        </w:rPr>
+        <w:t>Estrategia: Bull Call Spread ("diferencial alcista con calls"). En simple: apuestas a que sube, pero abaratas la apuesta vendiendo otra opción más arriba.</w:t>
       </w:r>
     </w:p>
     <w:p>
@@ -437,13 +837,77 @@
         <w:rPr>
           <w:b/>
         </w:rPr>
-        <w:t xml:space="preserve">NVDA: </w:t>
+        <w:t xml:space="preserve">Cómo se arma: </w:t>
       </w:r>
       <w:r>
         <w:rPr>
           <w:b w:val="0"/>
         </w:rPr>
-        <w:t>sin catalizador propio hasta fines de agosto; rehén del sentimiento sobre IA. Precio objetivo promedio $301 (+55%), pero sin gatillo esta semana.</w:t>
+        <w:t>compras una call strike 310 (apuestas a que sube) y vendes una call strike 322.5 (esa venta te devuelve dinero y reduce el costo). Vencimiento 17 o 24 de julio, evitando sus earnings.</w:t>
+      </w:r>
+    </w:p>
+    <w:p>
+      <w:pPr>
+        <w:pStyle w:val="ListBullet"/>
+        <w:spacing w:after="120"/>
+      </w:pPr>
+      <w:r>
+        <w:rPr>
+          <w:b/>
+          <w:color w:val="2E7D32"/>
+        </w:rPr>
+        <w:t xml:space="preserve">Por qué tiene sentido (la justificación): </w:t>
+      </w:r>
+      <w:r>
+        <w:rPr>
+          <w:b w:val="0"/>
+        </w:rPr>
+        <w:t>Apple ($308.6) está a solo ~4% de convertirse en la empresa más valiosa del mundo, superando a Nvidia. Ese tipo de titular atrae compradores y fondos que siguen la tendencia, lo que puede empujarla justo esta semana. Elegimos el SPREAD y no la call simple porque, en una semana sin noticias propias de Apple, una call sola perdería valor cada día por el desgaste del tiempo (theta); la call que vendemos compensa ese desgaste y abarata todo.</w:t>
+      </w:r>
+    </w:p>
+    <w:p>
+      <w:pPr>
+        <w:pStyle w:val="ListBullet"/>
+        <w:spacing w:after="120"/>
+      </w:pPr>
+      <w:r>
+        <w:rPr>
+          <w:b/>
+          <w:color w:val="B72828"/>
+        </w:rPr>
+        <w:t xml:space="preserve">El riesgo (dicho con claridad): </w:t>
+      </w:r>
+      <w:r>
+        <w:rPr>
+          <w:b w:val="0"/>
+        </w:rPr>
+        <w:t>la subida ya viene muy estirada; si se frena, pierdes lo que pagaste (nada más, está topado). Salir si Apple pierde los ~$300 (señal de que el impulso se rompió).</w:t>
+      </w:r>
+    </w:p>
+    <w:p>
+      <w:pPr>
+        <w:spacing w:before="280" w:after="120"/>
+      </w:pPr>
+      <w:r>
+        <w:rPr>
+          <w:b/>
+          <w:color w:val="2E74B5"/>
+          <w:sz w:val="26"/>
+        </w:rPr>
+        <w:t>Idea 4 — El índice SPY: cobrar si el mercado se queda quieto, o comprar un seguro barato</w:t>
+      </w:r>
+    </w:p>
+    <w:p>
+      <w:pPr>
+        <w:spacing w:after="80"/>
+      </w:pPr>
+      <w:r>
+        <w:rPr>
+          <w:b w:val="0"/>
+          <w:i w:val="0"/>
+          <w:sz w:val="22"/>
+        </w:rPr>
+        <w:t>Estrategia principal: Butterfly ("mariposa") de calls. En simple: una apuesta barata a que el índice termina la semana cerca de un nivel concreto, sin moverse mucho.</w:t>
       </w:r>
     </w:p>
     <w:p>
@@ -455,57 +919,13 @@
         <w:rPr>
           <w:b/>
         </w:rPr>
-        <w:t xml:space="preserve">DAL (soporte $92.7): </w:t>
+        <w:t xml:space="preserve">Cómo se arma: </w:t>
       </w:r>
       <w:r>
         <w:rPr>
           <w:b w:val="0"/>
         </w:rPr>
-        <w:t>reporta el viernes 10 antes de la apertura. 22 de 24 analistas en Strong Buy, 4 trimestres batiendo estimaciones, combustible más barato. Consenso: EPS ~$1.43–1.54, ingresos ~$17.5B.</w:t>
-      </w:r>
-    </w:p>
-    <w:p>
-      <w:r>
-        <w:br w:type="page"/>
-      </w:r>
-    </w:p>
-    <w:p>
-      <w:pPr>
-        <w:spacing w:before="240" w:after="120"/>
-      </w:pPr>
-      <w:r>
-        <w:rPr>
-          <w:b/>
-          <w:color w:val="1F3A5F"/>
-          <w:sz w:val="30"/>
-        </w:rPr>
-        <w:t>2. Las 4 operaciones recomendadas</w:t>
-      </w:r>
-    </w:p>
-    <w:p>
-      <w:pPr>
-        <w:spacing w:before="240" w:after="120"/>
-      </w:pPr>
-      <w:r>
-        <w:rPr>
-          <w:b/>
-          <w:color w:val="2E74B5"/>
-          <w:sz w:val="26"/>
-        </w:rPr>
-        <w:t>Idea 1 — DAL: Bull Put Spread sobre earnings</w:t>
-      </w:r>
-    </w:p>
-    <w:p>
-      <w:pPr>
-        <w:spacing w:after="120"/>
-      </w:pPr>
-      <w:r>
-        <w:rPr>
-          <w:i/>
-          <w:color w:val="555555"/>
-          <w:sz w:val="20"/>
-        </w:rPr>
-        <w:t>La mejor relación riesgo/beneficio de la semana.</w:t>
+        <w:t>mariposa 745/755/765 en calls, vencimiento 10 de julio. Cuesta poco y paga mucho si el índice se "estaciona" cerca de 755.</w:t>
       </w:r>
     </w:p>
     <w:p>
@@ -516,14 +936,15 @@
       <w:r>
         <w:rPr>
           <w:b/>
+          <w:color w:val="2E7D32"/>
         </w:rPr>
-        <w:t xml:space="preserve">Estructura: </w:t>
+        <w:t xml:space="preserve">Por qué tiene sentido (la justificación): </w:t>
       </w:r>
       <w:r>
         <w:rPr>
           <w:b w:val="0"/>
         </w:rPr>
-        <w:t>vender put 90 / comprar put 85, vencimiento 10 o 17 de julio.</w:t>
+        <w:t>es una semana con pocos datos (lo único fuerte son las minutas de la Fed el miércoles) y el mercado sube despacio y sin sobresaltos. Ese ambiente de "poco movimiento" es exactamente donde una mariposa rinde mejor: arriesgas poco para ganar bastante si el índice no se dispara ni se hunde.</w:t>
       </w:r>
     </w:p>
     <w:p>
@@ -534,251 +955,15 @@
       <w:r>
         <w:rPr>
           <w:b/>
+          <w:color w:val="2E7D32"/>
         </w:rPr>
-        <w:t xml:space="preserve">Por qué esta estrategia: </w:t>
+        <w:t xml:space="preserve">Alternativa defensiva (si ya tienes acciones): </w:t>
       </w:r>
       <w:r>
         <w:rPr>
           <w:b w:val="0"/>
         </w:rPr>
-        <w:t>la IV de DAL está inflada antes del reporte del viernes. El IV crush posterior trabaja a favor del vendedor de prima. El spread (y no la put desnuda) define el riesgo máximo en $500 − crédito por contrato.</w:t>
-      </w:r>
-    </w:p>
-    <w:p>
-      <w:pPr>
-        <w:pStyle w:val="ListBullet"/>
-        <w:spacing w:after="120"/>
-      </w:pPr>
-      <w:r>
-        <w:rPr>
-          <w:b/>
-        </w:rPr>
-        <w:t xml:space="preserve">Tesis: </w:t>
-      </w:r>
-      <w:r>
-        <w:rPr>
-          <w:b w:val="0"/>
-        </w:rPr>
-        <w:t>combustible barato (tratado EEUU–Irán), historial de sorpresas positivas, rotación hacia cíclicos, soporte en $92.7 como colchón.</w:t>
-      </w:r>
-    </w:p>
-    <w:p>
-      <w:pPr>
-        <w:pStyle w:val="ListBullet"/>
-        <w:spacing w:after="120"/>
-      </w:pPr>
-      <w:r>
-        <w:rPr>
-          <w:b/>
-        </w:rPr>
-        <w:t xml:space="preserve">Riesgo: </w:t>
-      </w:r>
-      <w:r>
-        <w:rPr>
-          <w:b w:val="0"/>
-        </w:rPr>
-        <w:t>se espera caída interanual del EPS de ~32%; si la guía decepciona y rompe soporte, se asume la pérdida definida. Cerrar al 50–60% del crédito máximo si se alcanza antes del viernes.</w:t>
-      </w:r>
-    </w:p>
-    <w:p>
-      <w:pPr>
-        <w:spacing w:before="240" w:after="120"/>
-      </w:pPr>
-      <w:r>
-        <w:rPr>
-          <w:b/>
-          <w:color w:val="2E74B5"/>
-          <w:sz w:val="26"/>
-        </w:rPr>
-        <w:t>Idea 2 — MSFT: Venta de Put (cash-secured) o Bull Put Spread</w:t>
-      </w:r>
-    </w:p>
-    <w:p>
-      <w:pPr>
-        <w:pStyle w:val="ListBullet"/>
-        <w:spacing w:after="120"/>
-      </w:pPr>
-      <w:r>
-        <w:rPr>
-          <w:b/>
-        </w:rPr>
-        <w:t xml:space="preserve">Estructura: </w:t>
-      </w:r>
-      <w:r>
-        <w:rPr>
-          <w:b w:val="0"/>
-        </w:rPr>
-        <w:t>vender put 370 (cash-secured) o spread 370/360, vencimiento 17 de julio — antes de sus earnings de fin de mes.</w:t>
-      </w:r>
-    </w:p>
-    <w:p>
-      <w:pPr>
-        <w:pStyle w:val="ListBullet"/>
-        <w:spacing w:after="120"/>
-      </w:pPr>
-      <w:r>
-        <w:rPr>
-          <w:b/>
-        </w:rPr>
-        <w:t xml:space="preserve">Por qué esta estrategia: </w:t>
-      </w:r>
-      <w:r>
-        <w:rPr>
-          <w:b w:val="0"/>
-        </w:rPr>
-        <w:t>tras −24%, la IV está elevada respecto a su historia y el pesimismo parece capitulación (mínimos desde 2023, Burry comprando calls). Vender el put te paga por comprometerte a comprar ~4% más abajo: si no llega, cobras la prima; si llega, entras con doble descuento.</w:t>
-      </w:r>
-    </w:p>
-    <w:p>
-      <w:pPr>
-        <w:pStyle w:val="ListBullet"/>
-        <w:spacing w:after="120"/>
-      </w:pPr>
-      <w:r>
-        <w:rPr>
-          <w:b/>
-        </w:rPr>
-        <w:t xml:space="preserve">Riesgo: </w:t>
-      </w:r>
-      <w:r>
-        <w:rPr>
-          <w:b w:val="0"/>
-        </w:rPr>
-        <w:t>el cuchillo puede seguir cayendo si el mercado sigue castigando el capex en IA. Solo con capital dispuesto a ser asignado, o usar el spread para definir riesgo.</w:t>
-      </w:r>
-    </w:p>
-    <w:p>
-      <w:pPr>
-        <w:spacing w:before="240" w:after="120"/>
-      </w:pPr>
-      <w:r>
-        <w:rPr>
-          <w:b/>
-          <w:color w:val="2E74B5"/>
-          <w:sz w:val="26"/>
-        </w:rPr>
-        <w:t>Idea 3 — AAPL: Bull Call Spread</w:t>
-      </w:r>
-    </w:p>
-    <w:p>
-      <w:pPr>
-        <w:pStyle w:val="ListBullet"/>
-        <w:spacing w:after="120"/>
-      </w:pPr>
-      <w:r>
-        <w:rPr>
-          <w:b/>
-        </w:rPr>
-        <w:t xml:space="preserve">Estructura: </w:t>
-      </w:r>
-      <w:r>
-        <w:rPr>
-          <w:b w:val="0"/>
-        </w:rPr>
-        <w:t>comprar call 310 / vender call 322.5, vencimiento 17 o 24 de julio (evitando earnings).</w:t>
-      </w:r>
-    </w:p>
-    <w:p>
-      <w:pPr>
-        <w:pStyle w:val="ListBullet"/>
-        <w:spacing w:after="120"/>
-      </w:pPr>
-      <w:r>
-        <w:rPr>
-          <w:b/>
-        </w:rPr>
-        <w:t xml:space="preserve">Por qué esta estrategia: </w:t>
-      </w:r>
-      <w:r>
-        <w:rPr>
-          <w:b w:val="0"/>
-        </w:rPr>
-        <w:t>con VIX en 15.8 el débito es razonable, y el spread reduce el costo frente a la call seca (la call vendida financia parte de la prima y neutraliza theta). El catalizador — destronar a Nvidia — puede atraer flujo momentum esta misma semana.</w:t>
-      </w:r>
-    </w:p>
-    <w:p>
-      <w:pPr>
-        <w:pStyle w:val="ListBullet"/>
-        <w:spacing w:after="120"/>
-      </w:pPr>
-      <w:r>
-        <w:rPr>
-          <w:b/>
-        </w:rPr>
-        <w:t xml:space="preserve">Riesgo: </w:t>
-      </w:r>
-      <w:r>
-        <w:rPr>
-          <w:b w:val="0"/>
-        </w:rPr>
-        <w:t>el rally está extendido; pérdida máxima = débito pagado (~1/3 del ancho del spread). No usar call simple: pagarías theta completa en una semana sin evento propio.</w:t>
-      </w:r>
-    </w:p>
-    <w:p>
-      <w:pPr>
-        <w:spacing w:before="240" w:after="120"/>
-      </w:pPr>
-      <w:r>
-        <w:rPr>
-          <w:b/>
-          <w:color w:val="2E74B5"/>
-          <w:sz w:val="26"/>
-        </w:rPr>
-        <w:t>Idea 4 — SPY: Butterfly de calls (o Put protector)</w:t>
-      </w:r>
-    </w:p>
-    <w:p>
-      <w:pPr>
-        <w:pStyle w:val="ListBullet"/>
-        <w:spacing w:after="120"/>
-      </w:pPr>
-      <w:r>
-        <w:rPr>
-          <w:b/>
-        </w:rPr>
-        <w:t xml:space="preserve">Estructura: </w:t>
-      </w:r>
-      <w:r>
-        <w:rPr>
-          <w:b w:val="0"/>
-        </w:rPr>
-        <w:t>mariposa 745/755/765 calls, vencimiento 10 de julio.</w:t>
-      </w:r>
-    </w:p>
-    <w:p>
-      <w:pPr>
-        <w:pStyle w:val="ListBullet"/>
-        <w:spacing w:after="120"/>
-      </w:pPr>
-      <w:r>
-        <w:rPr>
-          <w:b/>
-        </w:rPr>
-        <w:t xml:space="preserve">Por qué esta estrategia: </w:t>
-      </w:r>
-      <w:r>
-        <w:rPr>
-          <w:b w:val="0"/>
-        </w:rPr>
-        <w:t>semana de pocos datos (lo relevante son las minutas del miércoles), mercado en máximos con deriva lenta al alza y volatilidad realizada baja — escenario ideal para una mariposa: costo mínimo, pago máximo si el índice se estaciona cerca del cuerpo.</w:t>
-      </w:r>
-    </w:p>
-    <w:p>
-      <w:pPr>
-        <w:pStyle w:val="ListBullet"/>
-        <w:spacing w:after="120"/>
-      </w:pPr>
-      <w:r>
-        <w:rPr>
-          <w:b/>
-        </w:rPr>
-        <w:t xml:space="preserve">Alternativa defensiva: </w:t>
-      </w:r>
-      <w:r>
-        <w:rPr>
-          <w:b w:val="0"/>
-        </w:rPr>
-        <w:t>si tienes cartera larga, la Compra de Put OTM de SPY está históricamente barata con VIX &lt;16 — es el momento de comprar seguro, no de venderlo. Unas minutas más hawkish de Warsh son el riesgo de cola de la semana.</w:t>
+        <w:t>comprar una Put de SPY como SEGURO. Con el miedo tan bajo (VIX &lt;16), ese seguro está barato — es el mejor momento para comprar protección, no para venderla. El único susto posible de la semana sería que las minutas de la Fed salgan más duras de lo esperado.</w:t>
       </w:r>
     </w:p>
     <w:p>
@@ -788,7 +973,7 @@
     </w:p>
     <w:p>
       <w:pPr>
-        <w:spacing w:before="240" w:after="120"/>
+        <w:spacing w:before="280" w:after="120"/>
       </w:pPr>
       <w:r>
         <w:rPr>
@@ -799,6 +984,19 @@
         <w:t>3. Estrategias del listado que NO conviene usar esta semana</w:t>
       </w:r>
     </w:p>
+    <w:p>
+      <w:pPr>
+        <w:spacing w:after="120"/>
+      </w:pPr>
+      <w:r>
+        <w:rPr>
+          <w:b w:val="0"/>
+          <w:i w:val="0"/>
+          <w:sz w:val="22"/>
+        </w:rPr>
+        <w:t>Pediste que valorara TODA la lista de estrategias. Estas quedan descartadas por ahora, con el motivo en lenguaje llano:</w:t>
+      </w:r>
+    </w:p>
     <w:tbl>
       <w:tblPr>
         <w:tblStyle w:val="LightGrid-Accent1"/>
@@ -807,13 +1005,14 @@
         <w:tblLook w:firstColumn="1" w:firstRow="1" w:lastColumn="0" w:lastRow="0" w:noHBand="0" w:noVBand="1" w:val="04A0"/>
       </w:tblPr>
       <w:tblGrid>
-        <w:gridCol w:w="4320"/>
-        <w:gridCol w:w="4320"/>
+        <w:gridCol w:w="2880"/>
+        <w:gridCol w:w="2880"/>
+        <w:gridCol w:w="2880"/>
       </w:tblGrid>
       <w:tr>
         <w:tc>
           <w:tcPr>
-            <w:tcW w:type="dxa" w:w="4320"/>
+            <w:tcW w:type="dxa" w:w="2880"/>
           </w:tcPr>
           <w:p>
             <w:r/>
@@ -828,7 +1027,7 @@
         </w:tc>
         <w:tc>
           <w:tcPr>
-            <w:tcW w:type="dxa" w:w="4320"/>
+            <w:tcW w:type="dxa" w:w="2880"/>
           </w:tcPr>
           <w:p>
             <w:r/>
@@ -837,7 +1036,22 @@
                 <w:b/>
                 <w:sz w:val="20"/>
               </w:rPr>
-              <w:t>Por qué no</w:t>
+              <w:t>Qué es (en simple)</w:t>
+            </w:r>
+          </w:p>
+        </w:tc>
+        <w:tc>
+          <w:tcPr>
+            <w:tcW w:type="dxa" w:w="2880"/>
+          </w:tcPr>
+          <w:p>
+            <w:r/>
+            <w:r>
+              <w:rPr>
+                <w:b/>
+                <w:sz w:val="20"/>
+              </w:rPr>
+              <w:t>Por qué NO esta semana</w:t>
             </w:r>
           </w:p>
         </w:tc>
@@ -845,7 +1059,7 @@
       <w:tr>
         <w:tc>
           <w:tcPr>
-            <w:tcW w:type="dxa" w:w="4320"/>
+            <w:tcW w:type="dxa" w:w="2880"/>
           </w:tcPr>
           <w:p>
             <w:r/>
@@ -853,13 +1067,13 @@
               <w:rPr>
                 <w:sz w:val="19"/>
               </w:rPr>
-              <w:t>Straddle / Strangle largos (earnings)</w:t>
+              <w:t>Compra de Call / Compra de Put (solas)</w:t>
             </w:r>
           </w:p>
         </w:tc>
         <w:tc>
           <w:tcPr>
-            <w:tcW w:type="dxa" w:w="4320"/>
+            <w:tcW w:type="dxa" w:w="2880"/>
           </w:tcPr>
           <w:p>
             <w:r/>
@@ -867,7 +1081,21 @@
               <w:rPr>
                 <w:sz w:val="19"/>
               </w:rPr>
-              <w:t>El IV crush post-reporte destruye la prima aunque aciertes dirección; con VIX 15.8 tampoco hay expectativa de movimiento explosivo en índices</w:t>
+              <w:t>Apuesta directa a que sube (call) o baja (put)</w:t>
+            </w:r>
+          </w:p>
+        </w:tc>
+        <w:tc>
+          <w:tcPr>
+            <w:tcW w:type="dxa" w:w="2880"/>
+          </w:tcPr>
+          <w:p>
+            <w:r/>
+            <w:r>
+              <w:rPr>
+                <w:sz w:val="19"/>
+              </w:rPr>
+              <w:t>Pierden valor cada día por el desgaste del tiempo; sin un catalizador claro, es tirar prima. Mejor usarlas dentro de un spread</w:t>
             </w:r>
           </w:p>
         </w:tc>
@@ -875,7 +1103,95 @@
       <w:tr>
         <w:tc>
           <w:tcPr>
-            <w:tcW w:type="dxa" w:w="4320"/>
+            <w:tcW w:type="dxa" w:w="2880"/>
+          </w:tcPr>
+          <w:p>
+            <w:r/>
+            <w:r>
+              <w:rPr>
+                <w:sz w:val="19"/>
+              </w:rPr>
+              <w:t>Venta de Call desnuda</w:t>
+            </w:r>
+          </w:p>
+        </w:tc>
+        <w:tc>
+          <w:tcPr>
+            <w:tcW w:type="dxa" w:w="2880"/>
+          </w:tcPr>
+          <w:p>
+            <w:r/>
+            <w:r>
+              <w:rPr>
+                <w:sz w:val="19"/>
+              </w:rPr>
+              <w:t>Cobrar prima apostando a que NO sube, sin red</w:t>
+            </w:r>
+          </w:p>
+        </w:tc>
+        <w:tc>
+          <w:tcPr>
+            <w:tcW w:type="dxa" w:w="2880"/>
+          </w:tcPr>
+          <w:p>
+            <w:r/>
+            <w:r>
+              <w:rPr>
+                <w:sz w:val="19"/>
+              </w:rPr>
+              <w:t>Riesgo ILIMITADO si la acción se dispara, y el mercado está en máximos con impulso. Demasiado peligroso</w:t>
+            </w:r>
+          </w:p>
+        </w:tc>
+      </w:tr>
+      <w:tr>
+        <w:tc>
+          <w:tcPr>
+            <w:tcW w:type="dxa" w:w="2880"/>
+          </w:tcPr>
+          <w:p>
+            <w:r/>
+            <w:r>
+              <w:rPr>
+                <w:sz w:val="19"/>
+              </w:rPr>
+              <w:t>Straddle / Strangle</w:t>
+            </w:r>
+          </w:p>
+        </w:tc>
+        <w:tc>
+          <w:tcPr>
+            <w:tcW w:type="dxa" w:w="2880"/>
+          </w:tcPr>
+          <w:p>
+            <w:r/>
+            <w:r>
+              <w:rPr>
+                <w:sz w:val="19"/>
+              </w:rPr>
+              <w:t>Comprar call y put a la vez, apostando a un movimiento fuerte en cualquier dirección</w:t>
+            </w:r>
+          </w:p>
+        </w:tc>
+        <w:tc>
+          <w:tcPr>
+            <w:tcW w:type="dxa" w:w="2880"/>
+          </w:tcPr>
+          <w:p>
+            <w:r/>
+            <w:r>
+              <w:rPr>
+                <w:sz w:val="19"/>
+              </w:rPr>
+              <w:t>Con el mercado tan tranquilo (VIX 16) no se espera ese gran movimiento; y tras earnings el IV crush destruye la prima aunque aciertes</w:t>
+            </w:r>
+          </w:p>
+        </w:tc>
+      </w:tr>
+      <w:tr>
+        <w:tc>
+          <w:tcPr>
+            <w:tcW w:type="dxa" w:w="2880"/>
           </w:tcPr>
           <w:p>
             <w:r/>
@@ -889,7 +1205,7 @@
         </w:tc>
         <w:tc>
           <w:tcPr>
-            <w:tcW w:type="dxa" w:w="4320"/>
+            <w:tcW w:type="dxa" w:w="2880"/>
           </w:tcPr>
           <w:p>
             <w:r/>
@@ -897,7 +1213,21 @@
               <w:rPr>
                 <w:sz w:val="19"/>
               </w:rPr>
-              <w:t>Exigen expectativa de movimiento violento con sesgo direccional; nada en el calendario lo justifica</w:t>
+              <w:t>Variantes del straddle con más peso a un lado</w:t>
+            </w:r>
+          </w:p>
+        </w:tc>
+        <w:tc>
+          <w:tcPr>
+            <w:tcW w:type="dxa" w:w="2880"/>
+          </w:tcPr>
+          <w:p>
+            <w:r/>
+            <w:r>
+              <w:rPr>
+                <w:sz w:val="19"/>
+              </w:rPr>
+              <w:t>Necesitan esperar un movimiento violento con dirección; nada en el calendario lo justifica</w:t>
             </w:r>
           </w:p>
         </w:tc>
@@ -905,7 +1235,7 @@
       <w:tr>
         <w:tc>
           <w:tcPr>
-            <w:tcW w:type="dxa" w:w="4320"/>
+            <w:tcW w:type="dxa" w:w="2880"/>
           </w:tcPr>
           <w:p>
             <w:r/>
@@ -919,7 +1249,7 @@
         </w:tc>
         <w:tc>
           <w:tcPr>
-            <w:tcW w:type="dxa" w:w="4320"/>
+            <w:tcW w:type="dxa" w:w="2880"/>
           </w:tcPr>
           <w:p>
             <w:r/>
@@ -927,7 +1257,21 @@
               <w:rPr>
                 <w:sz w:val="19"/>
               </w:rPr>
-              <w:t>Es arbitraje de tasas; tras comisiones y horquillas, el retail no captura valor</w:t>
+              <w:t>Una combinación que en teoría "asegura" un rendimiento fijo</w:t>
+            </w:r>
+          </w:p>
+        </w:tc>
+        <w:tc>
+          <w:tcPr>
+            <w:tcW w:type="dxa" w:w="2880"/>
+          </w:tcPr>
+          <w:p>
+            <w:r/>
+            <w:r>
+              <w:rPr>
+                <w:sz w:val="19"/>
+              </w:rPr>
+              <w:t>Es arbitraje de tasas de interés; tras comisiones, el inversor particular no saca ventaja</w:t>
             </w:r>
           </w:p>
         </w:tc>
@@ -935,7 +1279,7 @@
       <w:tr>
         <w:tc>
           <w:tcPr>
-            <w:tcW w:type="dxa" w:w="4320"/>
+            <w:tcW w:type="dxa" w:w="2880"/>
           </w:tcPr>
           <w:p>
             <w:r/>
@@ -943,13 +1287,13 @@
               <w:rPr>
                 <w:sz w:val="19"/>
               </w:rPr>
-              <w:t>Venta de Call desnuda (NVDA/AAPL)</w:t>
+              <w:t>Bear Call Spread / Bear Put Spread</w:t>
             </w:r>
           </w:p>
         </w:tc>
         <w:tc>
           <w:tcPr>
-            <w:tcW w:type="dxa" w:w="4320"/>
+            <w:tcW w:type="dxa" w:w="2880"/>
           </w:tcPr>
           <w:p>
             <w:r/>
@@ -957,15 +1301,13 @@
               <w:rPr>
                 <w:sz w:val="19"/>
               </w:rPr>
-              <w:t>Riesgo ilimitado contra un mercado en máximos con momentum; si quieres sesgo bajista, usa Bear Call Spread</w:t>
+              <w:t>Apuestas a que el mercado BAJA, con riesgo limitado</w:t>
             </w:r>
           </w:p>
         </w:tc>
-      </w:tr>
-      <w:tr>
         <w:tc>
           <w:tcPr>
-            <w:tcW w:type="dxa" w:w="4320"/>
+            <w:tcW w:type="dxa" w:w="2880"/>
           </w:tcPr>
           <w:p>
             <w:r/>
@@ -973,30 +1315,29 @@
               <w:rPr>
                 <w:sz w:val="19"/>
               </w:rPr>
-              <w:t>Bear Put / Bear Call en índices</w:t>
-            </w:r>
-          </w:p>
-        </w:tc>
-        <w:tc>
-          <w:tcPr>
-            <w:tcW w:type="dxa" w:w="4320"/>
-          </w:tcPr>
-          <w:p>
-            <w:r/>
-            <w:r>
-              <w:rPr>
-                <w:sz w:val="19"/>
-              </w:rPr>
-              <w:t>Luchar contra la tendencia primaria alcista sin catalizador bajista confirmado es pagar por tener razón "algún día"</w:t>
+              <w:t>La tendencia general es alcista; apostar a la baja sin una razón concreta es remar contra la corriente</w:t>
             </w:r>
           </w:p>
         </w:tc>
       </w:tr>
     </w:tbl>
-    <w:p/>
     <w:p>
       <w:pPr>
-        <w:spacing w:before="240" w:after="120"/>
+        <w:spacing w:after="80"/>
+      </w:pPr>
+      <w:r>
+        <w:rPr>
+          <w:b w:val="0"/>
+          <w:i/>
+          <w:color w:val="555555"/>
+          <w:sz w:val="20"/>
+        </w:rPr>
+        <w:t>Nota: los "Bull Put Spread" y "Bull Call Spread" SÍ los usamos (ideas 1 y 3), y el "Butterfly" también (idea 4). Solo descartamos los que no encajan con el mercado de esta semana concreta.</w:t>
+      </w:r>
+    </w:p>
+    <w:p>
+      <w:pPr>
+        <w:spacing w:before="280" w:after="120"/>
       </w:pPr>
       <w:r>
         <w:rPr>
@@ -1004,7 +1345,7 @@
           <w:color w:val="1F3A5F"/>
           <w:sz w:val="30"/>
         </w:rPr>
-        <w:t>4. Reglas de gestión</w:t>
+        <w:t>4. Reglas para no equivocarse</w:t>
       </w:r>
     </w:p>
     <w:p>
@@ -1012,7 +1353,7 @@
         <w:pStyle w:val="ListNumber"/>
       </w:pPr>
       <w:r>
-        <w:t>No arriesgar más de 1–2% del capital por idea.</w:t>
+        <w:t>No arriesgar más del 1–2% de tu capital total en cada idea.</w:t>
       </w:r>
     </w:p>
     <w:p>
@@ -1020,7 +1361,7 @@
         <w:pStyle w:val="ListNumber"/>
       </w:pPr>
       <w:r>
-        <w:t>En los spreads de crédito (DAL, MSFT), tomar ganancias al 50–60% del crédito máximo.</w:t>
+        <w:t>En las operaciones donde cobras prima (Delta y Microsoft): cerrar y llevarte la ganancia cuando alcances el 50–60% del máximo posible. No ser codicioso.</w:t>
       </w:r>
     </w:p>
     <w:p>
@@ -1028,7 +1369,7 @@
         <w:pStyle w:val="ListNumber"/>
       </w:pPr>
       <w:r>
-        <w:t>En el Bull Call Spread de AAPL, salir si el subyacente pierde ~$300 (invalidación técnica del momentum).</w:t>
+        <w:t>En Apple: salir si el precio pierde los ~$300 (señal de que la subida se rompió).</w:t>
       </w:r>
     </w:p>
     <w:p>
@@ -1036,13 +1377,12 @@
         <w:pStyle w:val="ListNumber"/>
       </w:pPr>
       <w:r>
-        <w:t>Revisar las minutas del FOMC del miércoles 8: si el tono es más hawkish de lo esperado, reducir exposición direccional alcista.</w:t>
+        <w:t>Mirar las minutas de la Fed el miércoles 8: si el tono es más duro de lo esperado, reducir las apuestas alcistas.</w:t>
       </w:r>
     </w:p>
-    <w:p/>
     <w:p>
       <w:pPr>
-        <w:spacing w:before="240" w:after="120"/>
+        <w:spacing w:before="280" w:after="120"/>
       </w:pPr>
       <w:r>
         <w:rPr>
@@ -1050,7 +1390,7 @@
           <w:color w:val="1F3A5F"/>
           <w:sz w:val="24"/>
         </w:rPr>
-        <w:t>Fuentes</w:t>
+        <w:t>Fuentes consultadas</w:t>
       </w:r>
     </w:p>
     <w:p>
@@ -1074,7 +1414,7 @@
           <w:color w:val="555555"/>
           <w:sz w:val="19"/>
         </w:rPr>
-        <w:t>Tradingkey — US Stock Market This Week 2026-07-06</w:t>
+        <w:t>Tradingkey — US Stock Market This Week (06-07-2026)</w:t>
       </w:r>
     </w:p>
     <w:p>
@@ -1098,7 +1438,7 @@
           <w:color w:val="555555"/>
           <w:sz w:val="19"/>
         </w:rPr>
-        <w:t>Kiplinger — Earnings Calendar July 6-10</w:t>
+        <w:t>Kiplinger — Calendario de resultados 6-10 julio</w:t>
       </w:r>
     </w:p>
     <w:p>
@@ -1110,7 +1450,7 @@
           <w:color w:val="555555"/>
           <w:sz w:val="19"/>
         </w:rPr>
-        <w:t>StockTitan — PepsiCo Q2 2026 earnings date</w:t>
+        <w:t>StockTitan — Fecha de resultados de PepsiCo Q2 2026</w:t>
       </w:r>
     </w:p>
     <w:p>
@@ -1122,7 +1462,7 @@
           <w:color w:val="555555"/>
           <w:sz w:val="19"/>
         </w:rPr>
-        <w:t>Barchart — What to Expect From Delta's Q2 2026 Earnings</w:t>
+        <w:t>Barchart — Previsión de resultados de Delta Q2 2026</w:t>
       </w:r>
     </w:p>
     <w:p>
@@ -1134,7 +1474,7 @@
           <w:color w:val="555555"/>
           <w:sz w:val="19"/>
         </w:rPr>
-        <w:t>FX Leaders — DAL anchors $92.73 support ahead of Q2 earnings</w:t>
+        <w:t>FX Leaders — Soporte de Delta en $92.73 antes de resultados</w:t>
       </w:r>
     </w:p>
     <w:p>
@@ -1146,7 +1486,7 @@
           <w:color w:val="555555"/>
           <w:sz w:val="19"/>
         </w:rPr>
-        <w:t>The Motley Fool — Apple ~4% from overtaking Nvidia</w:t>
+        <w:t>The Motley Fool — Apple a ~4% de superar a Nvidia</w:t>
       </w:r>
     </w:p>
     <w:p>

</xml_diff>